<commit_message>
Restore prompt example text in Cert_Study_Hub_Guide.docx
Add the full Salesforce Certification-Style Study Question Generator
prompt as a bordered/shaded box in the guide document, between the
"Copy everything in the box below..." paragraph and "Tips for Using
This Prompt" section.

Co-Authored-By: Claude Opus 4.6 <noreply@anthropic.com>
</commit_message>
<xml_diff>
--- a/Cert_Study_Hub_Guide.docx
+++ b/Cert_Study_Hub_Guide.docx
@@ -2355,6 +2355,546 @@
         <w:t xml:space="preserve">Copy everything in the box below into Slackbot, replacing [CERTIFICATION NAME] with your certification:</w:t>
       </w:r>
     </w:p>
+    <w:tbl>
+      <w:tblPr>
+        <w:tblW w:type="pct" w:w="100%"/>
+        <w:tblBorders>
+          <w:top w:val="single" w:color="auto" w:sz="4"/>
+          <w:left w:val="single" w:color="auto" w:sz="4"/>
+          <w:bottom w:val="single" w:color="auto" w:sz="4"/>
+          <w:right w:val="single" w:color="auto" w:sz="4"/>
+          <w:insideH w:val="single" w:color="auto" w:sz="4"/>
+          <w:insideV w:val="single" w:color="auto" w:sz="4"/>
+        </w:tblBorders>
+      </w:tblPr>
+      <w:tblGrid>
+        <w:gridCol w:w="100"/>
+      </w:tblGrid>
+      <w:tr>
+        <w:tc>
+          <w:tcPr>
+            <w:tcBorders>
+              <w:top w:val="single" w:color="B0B0B0" w:sz="1"/>
+              <w:left w:val="single" w:color="B0B0B0" w:sz="1"/>
+              <w:bottom w:val="single" w:color="B0B0B0" w:sz="1"/>
+              <w:right w:val="single" w:color="B0B0B0" w:sz="1"/>
+            </w:tcBorders>
+            <w:shd w:fill="F5F5F5" w:val="clear"/>
+            <w:tcMar>
+              <w:top w:type="dxa" w:w="120"/>
+              <w:left w:type="dxa" w:w="180"/>
+              <w:bottom w:type="dxa" w:w="120"/>
+              <w:right w:type="dxa" w:w="180"/>
+            </w:tcMar>
+          </w:tcPr>
+          <w:p>
+            <w:pPr>
+              <w:spacing w:after="100"/>
+            </w:pPr>
+            <w:r>
+              <w:rPr>
+                <w:rFonts w:ascii="Consolas" w:cs="Consolas" w:eastAsia="Consolas" w:hAnsi="Consolas"/>
+                <w:b/>
+                <w:bCs/>
+                <w:sz w:val="20"/>
+                <w:szCs w:val="20"/>
+              </w:rPr>
+              <w:t xml:space="preserve">Salesforce Certification-Style Study Question Generator</w:t>
+            </w:r>
+          </w:p>
+          <w:p>
+            <w:pPr>
+              <w:spacing w:after="60"/>
+            </w:pPr>
+          </w:p>
+          <w:p>
+            <w:pPr>
+              <w:spacing w:after="100"/>
+            </w:pPr>
+            <w:r>
+              <w:rPr>
+                <w:rFonts w:ascii="Consolas" w:cs="Consolas" w:eastAsia="Consolas" w:hAnsi="Consolas"/>
+                <w:b/>
+                <w:bCs/>
+                <w:sz w:val="20"/>
+                <w:szCs w:val="20"/>
+              </w:rPr>
+              <w:t xml:space="preserve">1. Context</w:t>
+            </w:r>
+          </w:p>
+          <w:p>
+            <w:pPr>
+              <w:spacing w:after="100"/>
+            </w:pPr>
+            <w:r>
+              <w:rPr>
+                <w:rFonts w:ascii="Consolas" w:cs="Consolas" w:eastAsia="Consolas" w:hAnsi="Consolas"/>
+                <w:sz w:val="20"/>
+                <w:szCs w:val="20"/>
+              </w:rPr>
+              <w:t xml:space="preserve">You are simulating an official Salesforce Certification exam item writer for the [CERTIFICATION NAME] exam. Generate [##] questions that match the real exam’s tone, structure, and cognitive load — not generic quiz-style trivia. Base every question strictly on topics listed in the official exam guide’s weighted sections for this certification; do not introduce content outside those objectives, and note which exam guide section each question maps to.</w:t>
+            </w:r>
+          </w:p>
+          <w:p>
+            <w:pPr>
+              <w:spacing w:after="60"/>
+            </w:pPr>
+          </w:p>
+          <w:p>
+            <w:pPr>
+              <w:spacing w:after="100"/>
+            </w:pPr>
+            <w:r>
+              <w:rPr>
+                <w:rFonts w:ascii="Consolas" w:cs="Consolas" w:eastAsia="Consolas" w:hAnsi="Consolas"/>
+                <w:b/>
+                <w:bCs/>
+                <w:sz w:val="20"/>
+                <w:szCs w:val="20"/>
+              </w:rPr>
+              <w:t xml:space="preserve">2. Complexity</w:t>
+            </w:r>
+          </w:p>
+          <w:p>
+            <w:pPr>
+              <w:spacing w:after="100"/>
+            </w:pPr>
+            <w:r>
+              <w:rPr>
+                <w:rFonts w:ascii="Consolas" w:cs="Consolas" w:eastAsia="Consolas" w:hAnsi="Consolas"/>
+                <w:sz w:val="20"/>
+                <w:szCs w:val="20"/>
+              </w:rPr>
+              <w:t xml:space="preserve">Write scenario-based, architectural-reasoning questions — not definition recall. Each question should present a realistic customer/business scenario (a persona, a constraint, a business goal) and require the reader to reason about trade-offs, sequencing, or platform limits to pick the best answer, the way real exam items do. Avoid “what is X” phrasing; prefer “Given this scenario, which approach/action/configuration should the [consultant/architect] recommend?”</w:t>
+            </w:r>
+          </w:p>
+          <w:p>
+            <w:pPr>
+              <w:spacing w:after="100"/>
+            </w:pPr>
+            <w:r>
+              <w:rPr>
+                <w:rFonts w:ascii="Consolas" w:cs="Consolas" w:eastAsia="Consolas" w:hAnsi="Consolas"/>
+                <w:sz w:val="20"/>
+                <w:szCs w:val="20"/>
+              </w:rPr>
+              <w:t xml:space="preserve">Include a mix of question types:</w:t>
+            </w:r>
+          </w:p>
+          <w:p>
+            <w:pPr>
+              <w:spacing w:after="100"/>
+            </w:pPr>
+            <w:r>
+              <w:rPr>
+                <w:rFonts w:ascii="Consolas" w:cs="Consolas" w:eastAsia="Consolas" w:hAnsi="Consolas"/>
+                <w:sz w:val="20"/>
+                <w:szCs w:val="20"/>
+              </w:rPr>
+              <w:t xml:space="preserve">Most questions are single-select (four options, one correct).</w:t>
+            </w:r>
+          </w:p>
+          <w:p>
+            <w:pPr>
+              <w:spacing w:after="100"/>
+            </w:pPr>
+            <w:r>
+              <w:rPr>
+                <w:rFonts w:ascii="Consolas" w:cs="Consolas" w:eastAsia="Consolas" w:hAnsi="Consolas"/>
+                <w:sz w:val="20"/>
+                <w:szCs w:val="20"/>
+              </w:rPr>
+              <w:t xml:space="preserve">A subset (roughly 15–20%) should be multi-select, explicitly labeled “(Choose 2)” or “(Choose 3)” in the question stem, matching real exam conventions — these should have 5–6 options with the specified number of correct answers.</w:t>
+            </w:r>
+          </w:p>
+          <w:p>
+            <w:pPr>
+              <w:spacing w:after="60"/>
+            </w:pPr>
+          </w:p>
+          <w:p>
+            <w:pPr>
+              <w:spacing w:after="100"/>
+            </w:pPr>
+            <w:r>
+              <w:rPr>
+                <w:rFonts w:ascii="Consolas" w:cs="Consolas" w:eastAsia="Consolas" w:hAnsi="Consolas"/>
+                <w:b/>
+                <w:bCs/>
+                <w:sz w:val="20"/>
+                <w:szCs w:val="20"/>
+              </w:rPr>
+              <w:t xml:space="preserve">3. Constraints</w:t>
+            </w:r>
+          </w:p>
+          <w:p>
+            <w:pPr>
+              <w:spacing w:after="100"/>
+            </w:pPr>
+            <w:r>
+              <w:rPr>
+                <w:rFonts w:ascii="Consolas" w:cs="Consolas" w:eastAsia="Consolas" w:hAnsi="Consolas"/>
+                <w:sz w:val="20"/>
+                <w:szCs w:val="20"/>
+              </w:rPr>
+              <w:t xml:space="preserve">Single-select questions have exactly one correct answer. Never use “All of the above” or “None of the above.”</w:t>
+            </w:r>
+          </w:p>
+          <w:p>
+            <w:pPr>
+              <w:spacing w:after="100"/>
+            </w:pPr>
+            <w:r>
+              <w:rPr>
+                <w:rFonts w:ascii="Consolas" w:cs="Consolas" w:eastAsia="Consolas" w:hAnsi="Consolas"/>
+                <w:sz w:val="20"/>
+                <w:szCs w:val="20"/>
+              </w:rPr>
+              <w:t xml:space="preserve">Multi-select questions have exactly the stated number of correct answers (2 or 3), clearly indicated in the stem.</w:t>
+            </w:r>
+          </w:p>
+          <w:p>
+            <w:pPr>
+              <w:spacing w:after="100"/>
+            </w:pPr>
+            <w:r>
+              <w:rPr>
+                <w:rFonts w:ascii="Consolas" w:cs="Consolas" w:eastAsia="Consolas" w:hAnsi="Consolas"/>
+                <w:sz w:val="20"/>
+                <w:szCs w:val="20"/>
+              </w:rPr>
+              <w:t xml:space="preserve">Single-select: four options total. Multi-select: five or six options total.</w:t>
+            </w:r>
+          </w:p>
+          <w:p>
+            <w:pPr>
+              <w:spacing w:after="100"/>
+            </w:pPr>
+            <w:r>
+              <w:rPr>
+                <w:rFonts w:ascii="Consolas" w:cs="Consolas" w:eastAsia="Consolas" w:hAnsi="Consolas"/>
+                <w:sz w:val="20"/>
+                <w:szCs w:val="20"/>
+              </w:rPr>
+              <w:t xml:space="preserve">Distractors must be cognitively taxing, not obviously wrong — they should be at least as long and detailed as the correct answer(s), to counteract the baseline guessing advantage (33% for Agentforce-related exams, 25% for others on single-select; lower still on multi-select).</w:t>
+            </w:r>
+          </w:p>
+          <w:p>
+            <w:pPr>
+              <w:spacing w:after="100"/>
+            </w:pPr>
+            <w:r>
+              <w:rPr>
+                <w:rFonts w:ascii="Consolas" w:cs="Consolas" w:eastAsia="Consolas" w:hAnsi="Consolas"/>
+                <w:sz w:val="20"/>
+                <w:szCs w:val="20"/>
+              </w:rPr>
+              <w:t xml:space="preserve">Distractors must use authentic Salesforce terminology applied to the wrong context (e.g., a real feature name misapplied to a scenario it doesn’t solve) — never invent fake terms or violate Salesforce naming conventions.</w:t>
+            </w:r>
+          </w:p>
+          <w:p>
+            <w:pPr>
+              <w:spacing w:after="100"/>
+            </w:pPr>
+            <w:r>
+              <w:rPr>
+                <w:rFonts w:ascii="Consolas" w:cs="Consolas" w:eastAsia="Consolas" w:hAnsi="Consolas"/>
+                <w:sz w:val="20"/>
+                <w:szCs w:val="20"/>
+              </w:rPr>
+              <w:t xml:space="preserve">Vary the distractor typology across questions so the same “trap pattern” doesn’t repeat back-to-back. Rotate through types such as:</w:t>
+            </w:r>
+          </w:p>
+          <w:p>
+            <w:pPr>
+              <w:spacing w:after="100"/>
+            </w:pPr>
+            <w:r>
+              <w:rPr>
+                <w:rFonts w:ascii="Consolas" w:cs="Consolas" w:eastAsia="Consolas" w:hAnsi="Consolas"/>
+                <w:sz w:val="20"/>
+                <w:szCs w:val="20"/>
+              </w:rPr>
+              <w:t xml:space="preserve">  • Right feature, wrong scope/limit</w:t>
+            </w:r>
+          </w:p>
+          <w:p>
+            <w:pPr>
+              <w:spacing w:after="100"/>
+            </w:pPr>
+            <w:r>
+              <w:rPr>
+                <w:rFonts w:ascii="Consolas" w:cs="Consolas" w:eastAsia="Consolas" w:hAnsi="Consolas"/>
+                <w:sz w:val="20"/>
+                <w:szCs w:val="20"/>
+              </w:rPr>
+              <w:t xml:space="preserve">  • Right outcome, wrong mechanism</w:t>
+            </w:r>
+          </w:p>
+          <w:p>
+            <w:pPr>
+              <w:spacing w:after="100"/>
+            </w:pPr>
+            <w:r>
+              <w:rPr>
+                <w:rFonts w:ascii="Consolas" w:cs="Consolas" w:eastAsia="Consolas" w:hAnsi="Consolas"/>
+                <w:sz w:val="20"/>
+                <w:szCs w:val="20"/>
+              </w:rPr>
+              <w:t xml:space="preserve">  • Deprecated or legacy feature no longer recommended</w:t>
+            </w:r>
+          </w:p>
+          <w:p>
+            <w:pPr>
+              <w:spacing w:after="100"/>
+            </w:pPr>
+            <w:r>
+              <w:rPr>
+                <w:rFonts w:ascii="Consolas" w:cs="Consolas" w:eastAsia="Consolas" w:hAnsi="Consolas"/>
+                <w:sz w:val="20"/>
+                <w:szCs w:val="20"/>
+              </w:rPr>
+              <w:t xml:space="preserve">  • Feature from an adjacent cloud/product that sounds plausible but doesn’t apply</w:t>
+            </w:r>
+          </w:p>
+          <w:p>
+            <w:pPr>
+              <w:spacing w:after="100"/>
+            </w:pPr>
+            <w:r>
+              <w:rPr>
+                <w:rFonts w:ascii="Consolas" w:cs="Consolas" w:eastAsia="Consolas" w:hAnsi="Consolas"/>
+                <w:sz w:val="20"/>
+                <w:szCs w:val="20"/>
+              </w:rPr>
+              <w:t xml:space="preserve">  • Correct concept but violates a governance/licensing/data constraint</w:t>
+            </w:r>
+          </w:p>
+          <w:p>
+            <w:pPr>
+              <w:spacing w:after="60"/>
+            </w:pPr>
+          </w:p>
+          <w:p>
+            <w:pPr>
+              <w:spacing w:after="100"/>
+            </w:pPr>
+            <w:r>
+              <w:rPr>
+                <w:rFonts w:ascii="Consolas" w:cs="Consolas" w:eastAsia="Consolas" w:hAnsi="Consolas"/>
+                <w:b/>
+                <w:bCs/>
+                <w:sz w:val="20"/>
+                <w:szCs w:val="20"/>
+              </w:rPr>
+              <w:t xml:space="preserve">4. Checks</w:t>
+            </w:r>
+          </w:p>
+          <w:p>
+            <w:pPr>
+              <w:spacing w:after="100"/>
+            </w:pPr>
+            <w:r>
+              <w:rPr>
+                <w:rFonts w:ascii="Consolas" w:cs="Consolas" w:eastAsia="Consolas" w:hAnsi="Consolas"/>
+                <w:sz w:val="20"/>
+                <w:szCs w:val="20"/>
+              </w:rPr>
+              <w:t xml:space="preserve">For the correct answer(s), include a one-to-two sentence explanation of why it’s correct — the architectural principle or platform behavior that makes it the best choice given the scenario.</w:t>
+            </w:r>
+          </w:p>
+          <w:p>
+            <w:pPr>
+              <w:spacing w:after="100"/>
+            </w:pPr>
+            <w:r>
+              <w:rPr>
+                <w:rFonts w:ascii="Consolas" w:cs="Consolas" w:eastAsia="Consolas" w:hAnsi="Consolas"/>
+                <w:sz w:val="20"/>
+                <w:szCs w:val="20"/>
+              </w:rPr>
+              <w:t xml:space="preserve">For every wrong answer, include a one-sentence explanation stating exactly why it fails — cite the specific architectural reason or platform constraint violated (e.g., a limit, a sequencing dependency, a licensing restriction, or a scope mismatch). Do not just say “this is incorrect” — name the mechanism.</w:t>
+            </w:r>
+          </w:p>
+          <w:p>
+            <w:pPr>
+              <w:spacing w:after="60"/>
+            </w:pPr>
+          </w:p>
+          <w:p>
+            <w:pPr>
+              <w:spacing w:after="100"/>
+            </w:pPr>
+            <w:r>
+              <w:rPr>
+                <w:rFonts w:ascii="Consolas" w:cs="Consolas" w:eastAsia="Consolas" w:hAnsi="Consolas"/>
+                <w:b/>
+                <w:bCs/>
+                <w:sz w:val="20"/>
+                <w:szCs w:val="20"/>
+              </w:rPr>
+              <w:t xml:space="preserve">Output format per question:</w:t>
+            </w:r>
+          </w:p>
+          <w:p>
+            <w:pPr>
+              <w:spacing w:after="100"/>
+            </w:pPr>
+            <w:r>
+              <w:rPr>
+                <w:rFonts w:ascii="Consolas" w:cs="Consolas" w:eastAsia="Consolas" w:hAnsi="Consolas"/>
+                <w:sz w:val="20"/>
+                <w:szCs w:val="20"/>
+              </w:rPr>
+              <w:t xml:space="preserve">Q#. [Exam guide section] — [Scenario-based question] (Choose 1 / Choose 2 / Choose 3)</w:t>
+            </w:r>
+          </w:p>
+          <w:p>
+            <w:pPr>
+              <w:spacing w:after="100"/>
+            </w:pPr>
+            <w:r>
+              <w:rPr>
+                <w:rFonts w:ascii="Consolas" w:cs="Consolas" w:eastAsia="Consolas" w:hAnsi="Consolas"/>
+                <w:sz w:val="20"/>
+                <w:szCs w:val="20"/>
+              </w:rPr>
+              <w:t xml:space="preserve">A) ...</w:t>
+            </w:r>
+          </w:p>
+          <w:p>
+            <w:pPr>
+              <w:spacing w:after="100"/>
+            </w:pPr>
+            <w:r>
+              <w:rPr>
+                <w:rFonts w:ascii="Consolas" w:cs="Consolas" w:eastAsia="Consolas" w:hAnsi="Consolas"/>
+                <w:sz w:val="20"/>
+                <w:szCs w:val="20"/>
+              </w:rPr>
+              <w:t xml:space="preserve">B) ...</w:t>
+            </w:r>
+          </w:p>
+          <w:p>
+            <w:pPr>
+              <w:spacing w:after="100"/>
+            </w:pPr>
+            <w:r>
+              <w:rPr>
+                <w:rFonts w:ascii="Consolas" w:cs="Consolas" w:eastAsia="Consolas" w:hAnsi="Consolas"/>
+                <w:sz w:val="20"/>
+                <w:szCs w:val="20"/>
+              </w:rPr>
+              <w:t xml:space="preserve">C) ...</w:t>
+            </w:r>
+          </w:p>
+          <w:p>
+            <w:pPr>
+              <w:spacing w:after="100"/>
+            </w:pPr>
+            <w:r>
+              <w:rPr>
+                <w:rFonts w:ascii="Consolas" w:cs="Consolas" w:eastAsia="Consolas" w:hAnsi="Consolas"/>
+                <w:sz w:val="20"/>
+                <w:szCs w:val="20"/>
+              </w:rPr>
+              <w:t xml:space="preserve">D) ...</w:t>
+            </w:r>
+          </w:p>
+          <w:p>
+            <w:pPr>
+              <w:spacing w:after="100"/>
+            </w:pPr>
+            <w:r>
+              <w:rPr>
+                <w:rFonts w:ascii="Consolas" w:cs="Consolas" w:eastAsia="Consolas" w:hAnsi="Consolas"/>
+                <w:sz w:val="20"/>
+                <w:szCs w:val="20"/>
+              </w:rPr>
+              <w:t xml:space="preserve">[E) ... F) ... — multi-select only]</w:t>
+            </w:r>
+          </w:p>
+          <w:p>
+            <w:pPr>
+              <w:spacing w:after="100"/>
+            </w:pPr>
+            <w:r>
+              <w:rPr>
+                <w:rFonts w:ascii="Consolas" w:cs="Consolas" w:eastAsia="Consolas" w:hAnsi="Consolas"/>
+                <w:sz w:val="20"/>
+                <w:szCs w:val="20"/>
+              </w:rPr>
+              <w:t xml:space="preserve">Correct Answer(s): [Letter(s)]</w:t>
+            </w:r>
+          </w:p>
+          <w:p>
+            <w:pPr>
+              <w:spacing w:after="100"/>
+            </w:pPr>
+            <w:r>
+              <w:rPr>
+                <w:rFonts w:ascii="Consolas" w:cs="Consolas" w:eastAsia="Consolas" w:hAnsi="Consolas"/>
+                <w:sz w:val="20"/>
+                <w:szCs w:val="20"/>
+              </w:rPr>
+              <w:t xml:space="preserve">Why correct: [1-2 sentence explanation of the architectural principle]</w:t>
+            </w:r>
+          </w:p>
+          <w:p>
+            <w:pPr>
+              <w:spacing w:after="100"/>
+            </w:pPr>
+            <w:r>
+              <w:rPr>
+                <w:rFonts w:ascii="Consolas" w:cs="Consolas" w:eastAsia="Consolas" w:hAnsi="Consolas"/>
+                <w:sz w:val="20"/>
+                <w:szCs w:val="20"/>
+              </w:rPr>
+              <w:t xml:space="preserve">Why each wrong answer fails:</w:t>
+            </w:r>
+          </w:p>
+          <w:p>
+            <w:pPr>
+              <w:spacing w:after="100"/>
+            </w:pPr>
+            <w:r>
+              <w:rPr>
+                <w:rFonts w:ascii="Consolas" w:cs="Consolas" w:eastAsia="Consolas" w:hAnsi="Consolas"/>
+                <w:sz w:val="20"/>
+                <w:szCs w:val="20"/>
+              </w:rPr>
+              <w:t xml:space="preserve">- [Letter]: [one-sentence architectural reason]</w:t>
+            </w:r>
+          </w:p>
+          <w:p>
+            <w:pPr>
+              <w:spacing w:after="100"/>
+            </w:pPr>
+            <w:r>
+              <w:rPr>
+                <w:rFonts w:ascii="Consolas" w:cs="Consolas" w:eastAsia="Consolas" w:hAnsi="Consolas"/>
+                <w:sz w:val="20"/>
+                <w:szCs w:val="20"/>
+              </w:rPr>
+              <w:t xml:space="preserve">- [Letter]: [one-sentence architectural reason]</w:t>
+            </w:r>
+          </w:p>
+          <w:p>
+            <w:pPr>
+              <w:spacing w:after="100"/>
+            </w:pPr>
+            <w:r>
+              <w:rPr>
+                <w:rFonts w:ascii="Consolas" w:cs="Consolas" w:eastAsia="Consolas" w:hAnsi="Consolas"/>
+                <w:sz w:val="20"/>
+                <w:szCs w:val="20"/>
+              </w:rPr>
+              <w:t xml:space="preserve">- [Letter]: [one-sentence architectural reason]</w:t>
+            </w:r>
+          </w:p>
+        </w:tc>
+      </w:tr>
+    </w:tbl>
     <w:p>
       <w:pPr>
         <w:pStyle w:val="Heading2"/>

</xml_diff>